<commit_message>
Verdict: the category alone
The cell now reads "Approved with TAAP" and stops. The gloss on what the
verdict means, the date and the decider are gone: an explanatory clause after
the verdict reads as the generator qualifying a call that is not its to
qualify. The date and the decider remain in 06 and in the database, which is
where anyone who needs them should look, and 06's decision buckets are where
the meaning of each category is set out.

Co-Authored-By: Claude Opus 5 (1M context) <noreply@anthropic.com>
</commit_message>
<xml_diff>
--- a/reviews/2026-09-the-expert-ta/2026-09-the-expert-ta-internal.docx
+++ b/reviews/2026-09-the-expert-ta/2026-09-the-expert-ta-internal.docx
@@ -313,18 +313,6 @@
                 <w:b/>
               </w:rPr>
               <w:t>Approved with TAAP</w:t>
-            </w:r>
-            <w:r>
-              <w:rPr>
-                <w:b/>
-              </w:rPr>
-              <w:t xml:space="preserve"> — The product may be acquired only alongside a Temporary Alternative Access Plan covering the barriers below. </w:t>
-            </w:r>
-            <w:r>
-              <w:rPr>
-                <w:b/>
-              </w:rPr>
-              <w:t>2026-09-25 · Daniel Fontaine (SFBRN ATI Coordinator), reviewer of record</w:t>
             </w:r>
           </w:p>
         </w:tc>

</xml_diff>